<commit_message>
feat: add jenis_sidang field, drop link_file_penelaah, and create report view
- Add JENIS_SIDANG field to TAjuanSidang model and MahasiswaController
- Add KK field to TUser model and user management controllers
- Remove LINK_FILE_PENELAAH field and associated file upload logic from MahasiswaController
- Create VReportTipeI model and database view for S3 reporting
- Refactor ReportController to use VReportTipeI view instead of complex query
- Add migrations for schema changes and view creation
- Update user edit view to include KK field
- Update various template documents for sidang, penilaian, and proposal processes
- Improve report filtering logic for TU Prodi and FS/Monev roles
</commit_message>
<xml_diff>
--- a/template/UNDANGAN SIDANG.docx
+++ b/template/UNDANGAN SIDANG.docx
@@ -256,7 +256,7 @@
           </mc:Choice>
           <mc:Fallback>
             <w:pict>
-              <v:group w14:anchorId="37EDC5F5" id="Group 1" o:spid="_x0000_s1026" style="position:absolute;margin-left:8.8pt;margin-top:6.8pt;width:554.5pt;height:406.3pt;z-index:-15793664;mso-wrap-distance-left:0;mso-wrap-distance-right:0;mso-position-horizontal-relative:page;mso-position-vertical-relative:page" coordsize="70421,51600" o:gfxdata="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">
+              <v:group w14:anchorId="627A14D3" id="Group 1" o:spid="_x0000_s1026" style="position:absolute;margin-left:8.8pt;margin-top:6.8pt;width:554.5pt;height:406.3pt;z-index:-15793664;mso-wrap-distance-left:0;mso-wrap-distance-right:0;mso-position-horizontal-relative:page;mso-position-vertical-relative:page" coordsize="70421,51600" o:gfxdata="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">
                 <v:shapetype id="_x0000_t75" coordsize="21600,21600" o:spt="75" o:preferrelative="t" path="m@4@5l@4@11@9@11@9@5xe" filled="f" stroked="f">
                   <v:stroke joinstyle="miter"/>
                   <v:formulas>
@@ -759,16 +759,7 @@
         <w:ind w:right="320"/>
       </w:pPr>
       <w:r>
-        <w:t>ILHAM</w:t>
-      </w:r>
-      <w:r>
-        <w:rPr>
-          <w:spacing w:val="-3"/>
-        </w:rPr>
-        <w:t xml:space="preserve"> </w:t>
-      </w:r>
-      <w:r>
-        <w:t>ARISBAYA</w:t>
+        <w:t>$(NAM MAHASIWA)</w:t>
       </w:r>
       <w:r>
         <w:rPr>
@@ -780,16 +771,19 @@
         <w:t>(NIM</w:t>
       </w:r>
       <w:r>
-        <w:rPr>
-          <w:spacing w:val="-1"/>
-        </w:rPr>
         <w:t xml:space="preserve"> </w:t>
       </w:r>
       <w:r>
         <w:rPr>
           <w:spacing w:val="-2"/>
         </w:rPr>
-        <w:t>32318002)</w:t>
+        <w:t>$(NIM)</w:t>
+      </w:r>
+      <w:r>
+        <w:rPr>
+          <w:spacing w:val="-2"/>
+        </w:rPr>
+        <w:t>)</w:t>
       </w:r>
     </w:p>
     <w:p>
@@ -807,68 +801,7 @@
           <w:b/>
           <w:sz w:val="14"/>
         </w:rPr>
-        <w:t>(Program</w:t>
-      </w:r>
-      <w:r>
-        <w:rPr>
-          <w:b/>
-          <w:spacing w:val="-6"/>
-          <w:sz w:val="14"/>
-        </w:rPr>
-        <w:t xml:space="preserve"> </w:t>
-      </w:r>
-      <w:r>
-        <w:rPr>
-          <w:b/>
-          <w:sz w:val="14"/>
-        </w:rPr>
-        <w:t>Studi</w:t>
-      </w:r>
-      <w:r>
-        <w:rPr>
-          <w:b/>
-          <w:spacing w:val="-6"/>
-          <w:sz w:val="14"/>
-        </w:rPr>
-        <w:t xml:space="preserve"> </w:t>
-      </w:r>
-      <w:r>
-        <w:rPr>
-          <w:b/>
-          <w:sz w:val="14"/>
-        </w:rPr>
-        <w:t>Doktor</w:t>
-      </w:r>
-      <w:r>
-        <w:rPr>
-          <w:b/>
-          <w:spacing w:val="-4"/>
-          <w:sz w:val="14"/>
-        </w:rPr>
-        <w:t xml:space="preserve"> </w:t>
-      </w:r>
-      <w:r>
-        <w:rPr>
-          <w:b/>
-          <w:sz w:val="14"/>
-        </w:rPr>
-        <w:t>Teknik</w:t>
-      </w:r>
-      <w:r>
-        <w:rPr>
-          <w:b/>
-          <w:spacing w:val="-6"/>
-          <w:sz w:val="14"/>
-        </w:rPr>
-        <w:t xml:space="preserve"> </w:t>
-      </w:r>
-      <w:r>
-        <w:rPr>
-          <w:b/>
-          <w:spacing w:val="-2"/>
-          <w:sz w:val="14"/>
-        </w:rPr>
-        <w:t>Geofisika)</w:t>
+        <w:t>$(nama prodi)</w:t>
       </w:r>
     </w:p>
     <w:p>
@@ -920,118 +853,7 @@
         <w:ind w:left="671"/>
       </w:pPr>
       <w:r>
-        <w:t>Studi</w:t>
-      </w:r>
-      <w:r>
-        <w:rPr>
-          <w:spacing w:val="-4"/>
-        </w:rPr>
-        <w:t xml:space="preserve"> </w:t>
-      </w:r>
-      <w:r>
-        <w:t>Sesar</w:t>
-      </w:r>
-      <w:r>
-        <w:rPr>
-          <w:spacing w:val="-3"/>
-        </w:rPr>
-        <w:t xml:space="preserve"> </w:t>
-      </w:r>
-      <w:r>
-        <w:t>Aktif</w:t>
-      </w:r>
-      <w:r>
-        <w:rPr>
-          <w:spacing w:val="-3"/>
-        </w:rPr>
-        <w:t xml:space="preserve"> </w:t>
-      </w:r>
-      <w:r>
-        <w:t>di</w:t>
-      </w:r>
-      <w:r>
-        <w:rPr>
-          <w:spacing w:val="-4"/>
-        </w:rPr>
-        <w:t xml:space="preserve"> </w:t>
-      </w:r>
-      <w:r>
-        <w:t>Garut</w:t>
-      </w:r>
-      <w:r>
-        <w:rPr>
-          <w:spacing w:val="-3"/>
-        </w:rPr>
-        <w:t xml:space="preserve"> </w:t>
-      </w:r>
-      <w:r>
-        <w:t>Selatan,</w:t>
-      </w:r>
-      <w:r>
-        <w:rPr>
-          <w:spacing w:val="-4"/>
-        </w:rPr>
-        <w:t xml:space="preserve"> </w:t>
-      </w:r>
-      <w:r>
-        <w:t>Jawa</w:t>
-      </w:r>
-      <w:r>
-        <w:rPr>
-          <w:spacing w:val="-2"/>
-        </w:rPr>
-        <w:t xml:space="preserve"> </w:t>
-      </w:r>
-      <w:r>
-        <w:t>Barat,</w:t>
-      </w:r>
-      <w:r>
-        <w:rPr>
-          <w:spacing w:val="-5"/>
-        </w:rPr>
-        <w:t xml:space="preserve"> </w:t>
-      </w:r>
-      <w:r>
-        <w:t>Berdasarkan</w:t>
-      </w:r>
-      <w:r>
-        <w:rPr>
-          <w:spacing w:val="-3"/>
-        </w:rPr>
-        <w:t xml:space="preserve"> </w:t>
-      </w:r>
-      <w:r>
-        <w:t>Metode</w:t>
-      </w:r>
-      <w:r>
-        <w:rPr>
-          <w:spacing w:val="-3"/>
-        </w:rPr>
-        <w:t xml:space="preserve"> </w:t>
-      </w:r>
-      <w:r>
-        <w:t>Magnetotellurik</w:t>
-      </w:r>
-      <w:r>
-        <w:rPr>
-          <w:spacing w:val="-3"/>
-        </w:rPr>
-        <w:t xml:space="preserve"> </w:t>
-      </w:r>
-      <w:r>
-        <w:t>dan</w:t>
-      </w:r>
-      <w:r>
-        <w:rPr>
-          <w:spacing w:val="-3"/>
-        </w:rPr>
-        <w:t xml:space="preserve"> </w:t>
-      </w:r>
-      <w:r>
-        <w:rPr>
-          <w:spacing w:val="-2"/>
-        </w:rPr>
-        <w:t>Gravitasi</w:t>
+        <w:t>$(JUDUL)</w:t>
       </w:r>
     </w:p>
     <w:p>
@@ -1089,28 +911,12 @@
       </w:r>
       <w:r>
         <w:tab/>
-        <w:t>Prof.Dr.</w:t>
-      </w:r>
-      <w:r>
-        <w:rPr>
-          <w:spacing w:val="-5"/>
-        </w:rPr>
-        <w:t xml:space="preserve"> </w:t>
-      </w:r>
-      <w:r>
-        <w:t>Hendra</w:t>
-      </w:r>
-      <w:r>
-        <w:rPr>
-          <w:spacing w:val="-5"/>
-        </w:rPr>
-        <w:t xml:space="preserve"> </w:t>
-      </w:r>
-      <w:r>
-        <w:rPr>
-          <w:spacing w:val="-2"/>
-        </w:rPr>
-        <w:t>Grandis</w:t>
+      </w:r>
+      <w:r>
+        <w:t>$(nama ketua pembimbing)</w:t>
+      </w:r>
+      <w:r>
+        <w:t>.</w:t>
       </w:r>
     </w:p>
     <w:p>
@@ -1129,52 +935,28 @@
       </w:r>
       <w:r>
         <w:tab/>
-        <w:t>Prof.Dr.</w:t>
-      </w:r>
-      <w:r>
-        <w:rPr>
-          <w:spacing w:val="-9"/>
-        </w:rPr>
-        <w:t xml:space="preserve"> </w:t>
-      </w:r>
-      <w:r>
-        <w:t>Ir.</w:t>
-      </w:r>
-      <w:r>
-        <w:rPr>
-          <w:spacing w:val="-8"/>
-        </w:rPr>
-        <w:t xml:space="preserve"> </w:t>
-      </w:r>
-      <w:r>
-        <w:t>Prihadi</w:t>
-      </w:r>
-      <w:r>
-        <w:rPr>
-          <w:spacing w:val="-10"/>
-        </w:rPr>
-        <w:t xml:space="preserve"> </w:t>
-      </w:r>
-      <w:r>
-        <w:t>Soemintadiredja,</w:t>
-      </w:r>
-      <w:r>
-        <w:rPr>
-          <w:spacing w:val="-6"/>
-        </w:rPr>
-        <w:t xml:space="preserve"> </w:t>
-      </w:r>
-      <w:r>
-        <w:t>M.S.</w:t>
-      </w:r>
-      <w:r>
-        <w:rPr>
-          <w:spacing w:val="40"/>
-        </w:rPr>
-        <w:t xml:space="preserve"> </w:t>
-      </w:r>
-      <w:r>
-        <w:t>Dr. Warsa, S.Si., MT</w:t>
+      </w:r>
+      <w:r>
+        <w:t>$(nama pembimbing I)</w:t>
+      </w:r>
+      <w:r>
+        <w:t>.</w:t>
+      </w:r>
+    </w:p>
+    <w:p>
+      <w:pPr>
+        <w:pStyle w:val="BodyText"/>
+        <w:tabs>
+          <w:tab w:val="left" w:pos="1851"/>
+        </w:tabs>
+        <w:ind w:left="1851" w:right="4144" w:hanging="360"/>
+      </w:pPr>
+      <w:r>
+        <w:tab/>
+        <w:t>$(nama pembimbing II)</w:t>
+      </w:r>
+      <w:r>
+        <w:t>.</w:t>
       </w:r>
     </w:p>
     <w:p>
@@ -1213,73 +995,15 @@
       </w:r>
       <w:r>
         <w:tab/>
-        <w:t>Prof.</w:t>
+      </w:r>
+      <w:r>
+        <w:t>$(nama penguji I)</w:t>
       </w:r>
       <w:r>
         <w:rPr>
           <w:spacing w:val="-4"/>
         </w:rPr>
-        <w:t xml:space="preserve"> </w:t>
-      </w:r>
-      <w:r>
-        <w:t>Dr.</w:t>
-      </w:r>
-      <w:r>
-        <w:rPr>
-          <w:spacing w:val="-4"/>
-        </w:rPr>
-        <w:t xml:space="preserve"> </w:t>
-      </w:r>
-      <w:r>
-        <w:t>Ir.</w:t>
-      </w:r>
-      <w:r>
-        <w:rPr>
-          <w:spacing w:val="-4"/>
-        </w:rPr>
-        <w:t xml:space="preserve"> </w:t>
-      </w:r>
-      <w:r>
-        <w:t>Djoko</w:t>
-      </w:r>
-      <w:r>
-        <w:rPr>
-          <w:spacing w:val="-4"/>
-        </w:rPr>
-        <w:t xml:space="preserve"> </w:t>
-      </w:r>
-      <w:r>
-        <w:t>Santoso,</w:t>
-      </w:r>
-      <w:r>
-        <w:rPr>
-          <w:spacing w:val="-4"/>
-        </w:rPr>
-        <w:t xml:space="preserve"> </w:t>
-      </w:r>
-      <w:r>
-        <w:t>M.Sc.,</w:t>
-      </w:r>
-      <w:r>
-        <w:rPr>
-          <w:spacing w:val="-4"/>
-        </w:rPr>
-        <w:t xml:space="preserve"> </w:t>
-      </w:r>
-      <w:r>
-        <w:t>PG.Dip.,</w:t>
-      </w:r>
-      <w:r>
-        <w:rPr>
-          <w:spacing w:val="-3"/>
-        </w:rPr>
-        <w:t xml:space="preserve"> </w:t>
-      </w:r>
-      <w:r>
-        <w:rPr>
-          <w:spacing w:val="-4"/>
-        </w:rPr>
-        <w:t>IPU.</w:t>
+        <w:t>.</w:t>
       </w:r>
     </w:p>
     <w:p>
@@ -1288,52 +1012,16 @@
         <w:ind w:left="1851" w:right="3328"/>
       </w:pPr>
       <w:r>
-        <w:t>Dr.Eng.</w:t>
-      </w:r>
-      <w:r>
-        <w:rPr>
-          <w:spacing w:val="-9"/>
-        </w:rPr>
-        <w:t xml:space="preserve"> </w:t>
-      </w:r>
-      <w:r>
-        <w:t>Mirzam</w:t>
-      </w:r>
-      <w:r>
-        <w:rPr>
-          <w:spacing w:val="-7"/>
-        </w:rPr>
-        <w:t xml:space="preserve"> </w:t>
-      </w:r>
-      <w:r>
-        <w:t>Abdurrachman,</w:t>
-      </w:r>
-      <w:r>
-        <w:rPr>
-          <w:spacing w:val="-8"/>
-        </w:rPr>
-        <w:t xml:space="preserve"> </w:t>
-      </w:r>
-      <w:r>
-        <w:t>S.T.,</w:t>
-      </w:r>
-      <w:r>
-        <w:rPr>
-          <w:spacing w:val="-10"/>
-        </w:rPr>
-        <w:t xml:space="preserve"> </w:t>
-      </w:r>
-      <w:r>
-        <w:t>M.T.</w:t>
-      </w:r>
-      <w:r>
-        <w:rPr>
-          <w:spacing w:val="40"/>
-        </w:rPr>
-        <w:t xml:space="preserve"> </w:t>
-      </w:r>
-      <w:r>
-        <w:t>Prof.(Ris).Dr. Haryadi Permana (BRIN)</w:t>
+        <w:t>$(nama penguji II)</w:t>
+      </w:r>
+    </w:p>
+    <w:p>
+      <w:pPr>
+        <w:pStyle w:val="BodyText"/>
+        <w:ind w:left="1851" w:right="3328"/>
+      </w:pPr>
+      <w:r>
+        <w:t>$(nama penguji III).</w:t>
       </w:r>
     </w:p>
     <w:p>
@@ -1369,53 +1057,21 @@
       </w:r>
       <w:r>
         <w:tab/>
-        <w:t>Prof.Dr.</w:t>
-      </w:r>
-      <w:r>
-        <w:rPr>
-          <w:spacing w:val="-7"/>
-        </w:rPr>
-        <w:t xml:space="preserve"> </w:t>
-      </w:r>
-      <w:r>
-        <w:t>Andri</w:t>
-      </w:r>
-      <w:r>
-        <w:rPr>
-          <w:spacing w:val="-8"/>
-        </w:rPr>
-        <w:t xml:space="preserve"> </w:t>
-      </w:r>
-      <w:r>
-        <w:t>Dian</w:t>
-      </w:r>
-      <w:r>
-        <w:rPr>
-          <w:spacing w:val="-8"/>
-        </w:rPr>
-        <w:t xml:space="preserve"> </w:t>
-      </w:r>
-      <w:r>
-        <w:t>Nugraha,</w:t>
-      </w:r>
-      <w:r>
-        <w:rPr>
-          <w:spacing w:val="-7"/>
-        </w:rPr>
-        <w:t xml:space="preserve"> </w:t>
-      </w:r>
-      <w:r>
-        <w:t>S.Si.,</w:t>
-      </w:r>
-      <w:r>
-        <w:rPr>
-          <w:spacing w:val="-7"/>
-        </w:rPr>
-        <w:t xml:space="preserve"> </w:t>
-      </w:r>
-      <w:r>
-        <w:t>M.Si.,</w:t>
-      </w:r>
+      </w:r>
+      <w:r>
+        <w:t>$(ketua sidang)</w:t>
+      </w:r>
+    </w:p>
+    <w:p>
+      <w:pPr>
+        <w:pStyle w:val="BodyText"/>
+        <w:tabs>
+          <w:tab w:val="left" w:pos="1491"/>
+          <w:tab w:val="left" w:pos="1851"/>
+        </w:tabs>
+        <w:spacing w:before="34" w:line="392" w:lineRule="exact"/>
+        <w:ind w:right="4188"/>
+      </w:pPr>
       <w:r>
         <w:rPr>
           <w:spacing w:val="40"/>
@@ -1439,7 +1095,9 @@
       </w:r>
       <w:r>
         <w:tab/>
-        <w:t>Senin, 25 September 2023</w:t>
+      </w:r>
+      <w:r>
+        <w:t>$(tgl sidang)</w:t>
       </w:r>
     </w:p>
     <w:p>
@@ -1503,28 +1161,7 @@
         <w:t xml:space="preserve"> </w:t>
       </w:r>
       <w:r>
-        <w:t>08.30</w:t>
-      </w:r>
-      <w:r>
-        <w:rPr>
-          <w:spacing w:val="-3"/>
-        </w:rPr>
-        <w:t xml:space="preserve"> </w:t>
-      </w:r>
-      <w:r>
-        <w:t>-</w:t>
-      </w:r>
-      <w:r>
-        <w:rPr>
-          <w:spacing w:val="1"/>
-        </w:rPr>
-        <w:t xml:space="preserve"> </w:t>
-      </w:r>
-      <w:r>
-        <w:rPr>
-          <w:spacing w:val="-2"/>
-        </w:rPr>
-        <w:t>09.00</w:t>
+        <w:t>$(waktu – waktu selesai)</w:t>
       </w:r>
     </w:p>
     <w:p>
@@ -1561,121 +1198,7 @@
         <w:t xml:space="preserve"> </w:t>
       </w:r>
       <w:r>
-        <w:t>Ruang</w:t>
-      </w:r>
-      <w:r>
-        <w:rPr>
-          <w:spacing w:val="-3"/>
-        </w:rPr>
-        <w:t xml:space="preserve"> </w:t>
-      </w:r>
-      <w:r>
-        <w:t>Rapat</w:t>
-      </w:r>
-      <w:r>
-        <w:rPr>
-          <w:spacing w:val="-4"/>
-        </w:rPr>
-        <w:t xml:space="preserve"> </w:t>
-      </w:r>
-      <w:r>
-        <w:t>FTTM-ITB,</w:t>
-      </w:r>
-      <w:r>
-        <w:rPr>
-          <w:spacing w:val="-2"/>
-        </w:rPr>
-        <w:t xml:space="preserve"> </w:t>
-      </w:r>
-      <w:r>
-        <w:t>Ged.</w:t>
-      </w:r>
-      <w:r>
-        <w:rPr>
-          <w:spacing w:val="-3"/>
-        </w:rPr>
-        <w:t xml:space="preserve"> </w:t>
-      </w:r>
-      <w:r>
-        <w:t>Basic</w:t>
-      </w:r>
-      <w:r>
-        <w:rPr>
-          <w:spacing w:val="-3"/>
-        </w:rPr>
-        <w:t xml:space="preserve"> </w:t>
-      </w:r>
-      <w:r>
-        <w:t>Science</w:t>
-      </w:r>
-      <w:r>
-        <w:rPr>
-          <w:spacing w:val="-3"/>
-        </w:rPr>
-        <w:t xml:space="preserve"> </w:t>
-      </w:r>
-      <w:r>
-        <w:t>Center</w:t>
-      </w:r>
-      <w:r>
-        <w:rPr>
-          <w:spacing w:val="-3"/>
-        </w:rPr>
-        <w:t xml:space="preserve"> </w:t>
-      </w:r>
-      <w:r>
-        <w:t>B</w:t>
-      </w:r>
-      <w:r>
-        <w:rPr>
-          <w:spacing w:val="-5"/>
-        </w:rPr>
-        <w:t xml:space="preserve"> </w:t>
-      </w:r>
-      <w:r>
-        <w:t>Lt.</w:t>
-      </w:r>
-      <w:r>
-        <w:rPr>
-          <w:spacing w:val="-2"/>
-        </w:rPr>
-        <w:t xml:space="preserve"> </w:t>
-      </w:r>
-      <w:r>
-        <w:t>4,</w:t>
-      </w:r>
-      <w:r>
-        <w:rPr>
-          <w:spacing w:val="-2"/>
-        </w:rPr>
-        <w:t xml:space="preserve"> </w:t>
-      </w:r>
-      <w:r>
-        <w:t>Jl.</w:t>
-      </w:r>
-      <w:r>
-        <w:rPr>
-          <w:spacing w:val="-3"/>
-        </w:rPr>
-        <w:t xml:space="preserve"> </w:t>
-      </w:r>
-      <w:r>
-        <w:t>Ganesha</w:t>
-      </w:r>
-      <w:r>
-        <w:rPr>
-          <w:spacing w:val="-3"/>
-        </w:rPr>
-        <w:t xml:space="preserve"> </w:t>
-      </w:r>
-      <w:r>
-        <w:t>10</w:t>
-      </w:r>
-      <w:r>
-        <w:rPr>
-          <w:spacing w:val="-2"/>
-        </w:rPr>
-        <w:t xml:space="preserve"> Bandung</w:t>
+        <w:t>$(ruang)</w:t>
       </w:r>
     </w:p>
     <w:p>
@@ -1725,22 +1248,10 @@
       </w:r>
       <w:r>
         <w:tab/>
-        <w:t>: 09.00</w:t>
-      </w:r>
-      <w:r>
-        <w:rPr>
-          <w:spacing w:val="35"/>
-        </w:rPr>
-        <w:t xml:space="preserve"> </w:t>
-      </w:r>
-      <w:r>
-        <w:t>–</w:t>
-      </w:r>
-      <w:r>
-        <w:rPr>
-          <w:spacing w:val="-2"/>
-        </w:rPr>
-        <w:t xml:space="preserve"> 11.30</w:t>
+        <w:t xml:space="preserve">: </w:t>
+      </w:r>
+      <w:r>
+        <w:t>$(waktu selesai – di tambah 2,5 jam)</w:t>
       </w:r>
     </w:p>
     <w:p>
@@ -1748,163 +1259,50 @@
         <w:pStyle w:val="BodyText"/>
         <w:spacing w:before="2" w:line="480" w:lineRule="auto"/>
         <w:ind w:left="1767" w:right="498" w:firstLine="84"/>
+      </w:pPr>
+      <w:r>
+        <w:t>2.</w:t>
+      </w:r>
+      <w:r>
+        <w:rPr>
+          <w:spacing w:val="-2"/>
+        </w:rPr>
+        <w:t xml:space="preserve"> </w:t>
+      </w:r>
+      <w:r>
+        <w:t>Tempat</w:t>
+      </w:r>
+      <w:r>
+        <w:rPr>
+          <w:spacing w:val="67"/>
+        </w:rPr>
+        <w:t xml:space="preserve"> </w:t>
+      </w:r>
+      <w:r>
+        <w:t>:</w:t>
+      </w:r>
+      <w:r>
+        <w:rPr>
+          <w:spacing w:val="-2"/>
+        </w:rPr>
+        <w:t xml:space="preserve"> </w:t>
+      </w:r>
+      <w:r>
+        <w:rPr>
+          <w:spacing w:val="-2"/>
+        </w:rPr>
+        <w:t>$(ruang)</w:t>
+      </w:r>
+    </w:p>
+    <w:p>
+      <w:pPr>
+        <w:pStyle w:val="BodyText"/>
+        <w:spacing w:before="2" w:line="480" w:lineRule="auto"/>
+        <w:ind w:left="1767" w:right="498" w:firstLine="84"/>
         <w:rPr>
           <w:b/>
         </w:rPr>
       </w:pPr>
-      <w:r>
-        <w:t>2.</w:t>
-      </w:r>
-      <w:r>
-        <w:rPr>
-          <w:spacing w:val="-2"/>
-        </w:rPr>
-        <w:t xml:space="preserve"> </w:t>
-      </w:r>
-      <w:r>
-        <w:t>Tempat</w:t>
-      </w:r>
-      <w:r>
-        <w:rPr>
-          <w:spacing w:val="67"/>
-        </w:rPr>
-        <w:t xml:space="preserve"> </w:t>
-      </w:r>
-      <w:r>
-        <w:t>:</w:t>
-      </w:r>
-      <w:r>
-        <w:rPr>
-          <w:spacing w:val="-2"/>
-        </w:rPr>
-        <w:t xml:space="preserve"> </w:t>
-      </w:r>
-      <w:r>
-        <w:t>Ruang</w:t>
-      </w:r>
-      <w:r>
-        <w:rPr>
-          <w:spacing w:val="-2"/>
-        </w:rPr>
-        <w:t xml:space="preserve"> </w:t>
-      </w:r>
-      <w:r>
-        <w:t>Rapat</w:t>
-      </w:r>
-      <w:r>
-        <w:rPr>
-          <w:spacing w:val="-4"/>
-        </w:rPr>
-        <w:t xml:space="preserve"> </w:t>
-      </w:r>
-      <w:r>
-        <w:t>FTTM-ITB,</w:t>
-      </w:r>
-      <w:r>
-        <w:rPr>
-          <w:spacing w:val="-2"/>
-        </w:rPr>
-        <w:t xml:space="preserve"> </w:t>
-      </w:r>
-      <w:r>
-        <w:t>Ged.</w:t>
-      </w:r>
-      <w:r>
-        <w:rPr>
-          <w:spacing w:val="-2"/>
-        </w:rPr>
-        <w:t xml:space="preserve"> </w:t>
-      </w:r>
-      <w:r>
-        <w:t>Basic</w:t>
-      </w:r>
-      <w:r>
-        <w:rPr>
-          <w:spacing w:val="-3"/>
-        </w:rPr>
-        <w:t xml:space="preserve"> </w:t>
-      </w:r>
-      <w:r>
-        <w:t>Science</w:t>
-      </w:r>
-      <w:r>
-        <w:rPr>
-          <w:spacing w:val="-3"/>
-        </w:rPr>
-        <w:t xml:space="preserve"> </w:t>
-      </w:r>
-      <w:r>
-        <w:t>Center</w:t>
-      </w:r>
-      <w:r>
-        <w:rPr>
-          <w:spacing w:val="-3"/>
-        </w:rPr>
-        <w:t xml:space="preserve"> </w:t>
-      </w:r>
-      <w:r>
-        <w:t>B</w:t>
-      </w:r>
-      <w:r>
-        <w:rPr>
-          <w:spacing w:val="-4"/>
-        </w:rPr>
-        <w:t xml:space="preserve"> </w:t>
-      </w:r>
-      <w:r>
-        <w:t>Lt.</w:t>
-      </w:r>
-      <w:r>
-        <w:rPr>
-          <w:spacing w:val="-2"/>
-        </w:rPr>
-        <w:t xml:space="preserve"> </w:t>
-      </w:r>
-      <w:r>
-        <w:t>4,</w:t>
-      </w:r>
-      <w:r>
-        <w:rPr>
-          <w:spacing w:val="-2"/>
-        </w:rPr>
-        <w:t xml:space="preserve"> </w:t>
-      </w:r>
-      <w:r>
-        <w:t>Jl.</w:t>
-      </w:r>
-      <w:r>
-        <w:rPr>
-          <w:spacing w:val="-2"/>
-        </w:rPr>
-        <w:t xml:space="preserve"> </w:t>
-      </w:r>
-      <w:r>
-        <w:t>Ganesha</w:t>
-      </w:r>
-      <w:r>
-        <w:rPr>
-          <w:spacing w:val="-3"/>
-        </w:rPr>
-        <w:t xml:space="preserve"> </w:t>
-      </w:r>
-      <w:r>
-        <w:t>10</w:t>
-      </w:r>
-      <w:r>
-        <w:rPr>
-          <w:spacing w:val="-2"/>
-        </w:rPr>
-        <w:t xml:space="preserve"> </w:t>
-      </w:r>
-      <w:r>
-        <w:t>Bandung</w:t>
-      </w:r>
-      <w:r>
-        <w:rPr>
-          <w:spacing w:val="40"/>
-        </w:rPr>
-        <w:t xml:space="preserve"> </w:t>
-      </w:r>
       <w:r>
         <w:t>Tim Pembimbing, Tim Penguji, dan KSPs: pakaian</w:t>
       </w:r>
@@ -1936,45 +1334,7 @@
           <w:b/>
           <w:sz w:val="16"/>
         </w:rPr>
-        <w:t>Prof.</w:t>
-      </w:r>
-      <w:r>
-        <w:rPr>
-          <w:b/>
-          <w:spacing w:val="-3"/>
-          <w:sz w:val="16"/>
-        </w:rPr>
-        <w:t xml:space="preserve"> </w:t>
-      </w:r>
-      <w:r>
-        <w:rPr>
-          <w:b/>
-          <w:sz w:val="16"/>
-        </w:rPr>
-        <w:t>Dr.</w:t>
-      </w:r>
-      <w:r>
-        <w:rPr>
-          <w:b/>
-          <w:spacing w:val="32"/>
-          <w:sz w:val="16"/>
-        </w:rPr>
-        <w:t xml:space="preserve"> </w:t>
-      </w:r>
-      <w:r>
-        <w:rPr>
-          <w:b/>
-          <w:sz w:val="16"/>
-        </w:rPr>
-        <w:t>Suprijadi,</w:t>
-      </w:r>
-      <w:r>
-        <w:rPr>
-          <w:b/>
-          <w:spacing w:val="-3"/>
-          <w:sz w:val="16"/>
-        </w:rPr>
-        <w:t xml:space="preserve"> </w:t>
+        <w:t>$(nama user status dekan ‘y’)</w:t>
       </w:r>
       <w:r>
         <w:rPr>
@@ -1982,7 +1342,7 @@
           <w:spacing w:val="-2"/>
           <w:sz w:val="16"/>
         </w:rPr>
-        <w:t>M.Eng.</w:t>
+        <w:t>.</w:t>
       </w:r>
     </w:p>
     <w:p>

</xml_diff>